<commit_message>
PM01 activities and Logbook updated
</commit_message>
<xml_diff>
--- a/Logbook/Ryan Ward JavaScript Practical Logbook.docx
+++ b/Logbook/Ryan Ward JavaScript Practical Logbook.docx
@@ -155,13 +155,23 @@
                 <w:lang w:val="fr-FR"/>
               </w:rPr>
             </w:pPr>
+            <w:proofErr w:type="spellStart"/>
             <w:r>
               <w:rPr>
                 <w:color w:val="111111"/>
                 <w:sz w:val="18"/>
                 <w:lang w:val="fr-FR"/>
               </w:rPr>
-              <w:t>Skills Programme: JavaScript Programmer</w:t>
+              <w:t>Skills</w:t>
+            </w:r>
+            <w:proofErr w:type="spellEnd"/>
+            <w:r>
+              <w:rPr>
+                <w:color w:val="111111"/>
+                <w:sz w:val="18"/>
+                <w:lang w:val="fr-FR"/>
+              </w:rPr>
+              <w:t xml:space="preserve"> Programme: JavaScript Programmer</w:t>
             </w:r>
           </w:p>
           <w:p>
@@ -5199,7 +5209,31 @@
           </w:tcPr>
           <w:p>
             <w:r>
-              <w:t>C:\Users\ryanwa\OneDrive - Redpanda Software\Desktop\My Stuff\Personal\Javascript Training\LogBook\PM01 evidence</w:t>
+              <w:t xml:space="preserve">C:\Users\ryanwa\OneDrive - </w:t>
+            </w:r>
+            <w:proofErr w:type="spellStart"/>
+            <w:r>
+              <w:t>Redpanda</w:t>
+            </w:r>
+            <w:proofErr w:type="spellEnd"/>
+            <w:r>
+              <w:t xml:space="preserve"> Software\Desktop\My Stuff\Personal\</w:t>
+            </w:r>
+            <w:proofErr w:type="spellStart"/>
+            <w:r>
+              <w:t>Javascript</w:t>
+            </w:r>
+            <w:proofErr w:type="spellEnd"/>
+            <w:r>
+              <w:t xml:space="preserve"> Training\</w:t>
+            </w:r>
+            <w:proofErr w:type="spellStart"/>
+            <w:r>
+              <w:t>LogBook</w:t>
+            </w:r>
+            <w:proofErr w:type="spellEnd"/>
+            <w:r>
+              <w:t>\PM01 evidence</w:t>
             </w:r>
           </w:p>
         </w:tc>
@@ -7781,7 +7815,31 @@
           </w:tcPr>
           <w:p>
             <w:r>
-              <w:t>C:\Users\ryanwa\OneDrive - Redpanda Software\Desktop\My Stuff\Personal\Javascript Training\LogBook\PM01 evidence</w:t>
+              <w:t xml:space="preserve">C:\Users\ryanwa\OneDrive - </w:t>
+            </w:r>
+            <w:proofErr w:type="spellStart"/>
+            <w:r>
+              <w:t>Redpanda</w:t>
+            </w:r>
+            <w:proofErr w:type="spellEnd"/>
+            <w:r>
+              <w:t xml:space="preserve"> Software\Desktop\My Stuff\Personal\</w:t>
+            </w:r>
+            <w:proofErr w:type="spellStart"/>
+            <w:r>
+              <w:t>Javascript</w:t>
+            </w:r>
+            <w:proofErr w:type="spellEnd"/>
+            <w:r>
+              <w:t xml:space="preserve"> Training\</w:t>
+            </w:r>
+            <w:proofErr w:type="spellStart"/>
+            <w:r>
+              <w:t>LogBook</w:t>
+            </w:r>
+            <w:proofErr w:type="spellEnd"/>
+            <w:r>
+              <w:t>\PM01 evidence</w:t>
             </w:r>
           </w:p>
         </w:tc>
@@ -8919,9 +8977,77 @@
       </w:pPr>
       <w:r>
         <w:rPr>
+          <w:noProof/>
           <w:sz w:val="18"/>
         </w:rPr>
+        <w:drawing>
+          <wp:anchor distT="0" distB="0" distL="114300" distR="114300" simplePos="0" relativeHeight="251798528" behindDoc="0" locked="0" layoutInCell="1" allowOverlap="1" wp14:anchorId="7EF79ABD" wp14:editId="7506EE78">
+            <wp:simplePos x="0" y="0"/>
+            <wp:positionH relativeFrom="column">
+              <wp:posOffset>253706</wp:posOffset>
+            </wp:positionH>
+            <wp:positionV relativeFrom="paragraph">
+              <wp:posOffset>47570</wp:posOffset>
+            </wp:positionV>
+            <wp:extent cx="64770" cy="64770"/>
+            <wp:effectExtent l="0" t="0" r="0" b="0"/>
+            <wp:wrapNone/>
+            <wp:docPr id="1255269933" name="Graphic 1" descr="Checkmark with solid fill"/>
+            <wp:cNvGraphicFramePr>
+              <a:graphicFrameLocks xmlns:a="http://schemas.openxmlformats.org/drawingml/2006/main" noChangeAspect="1"/>
+            </wp:cNvGraphicFramePr>
+            <a:graphic xmlns:a="http://schemas.openxmlformats.org/drawingml/2006/main">
+              <a:graphicData uri="http://schemas.openxmlformats.org/drawingml/2006/picture">
+                <pic:pic xmlns:pic="http://schemas.openxmlformats.org/drawingml/2006/picture">
+                  <pic:nvPicPr>
+                    <pic:cNvPr id="1580647732" name="Graphic 1580647732" descr="Checkmark with solid fill"/>
+                    <pic:cNvPicPr/>
+                  </pic:nvPicPr>
+                  <pic:blipFill>
+                    <a:blip r:embed="rId8">
+                      <a:extLst>
+                        <a:ext uri="{96DAC541-7B7A-43D3-8B79-37D633B846F1}">
+                          <asvg:svgBlip xmlns:asvg="http://schemas.microsoft.com/office/drawing/2016/SVG/main" r:embed="rId9"/>
+                        </a:ext>
+                      </a:extLst>
+                    </a:blip>
+                    <a:stretch>
+                      <a:fillRect/>
+                    </a:stretch>
+                  </pic:blipFill>
+                  <pic:spPr>
+                    <a:xfrm>
+                      <a:off x="0" y="0"/>
+                      <a:ext cx="64770" cy="64770"/>
+                    </a:xfrm>
+                    <a:prstGeom prst="rect">
+                      <a:avLst/>
+                    </a:prstGeom>
+                  </pic:spPr>
+                </pic:pic>
+              </a:graphicData>
+            </a:graphic>
+            <wp14:sizeRelH relativeFrom="margin">
+              <wp14:pctWidth>0</wp14:pctWidth>
+            </wp14:sizeRelH>
+            <wp14:sizeRelV relativeFrom="margin">
+              <wp14:pctHeight>0</wp14:pctHeight>
+            </wp14:sizeRelV>
+          </wp:anchor>
+        </w:drawing>
+      </w:r>
+      <w:r>
+        <w:rPr>
+          <w:sz w:val="18"/>
+        </w:rPr>
         <w:t>☐ Create a GitHub repository.</w:t>
+      </w:r>
+      <w:r>
+        <w:rPr>
+          <w:noProof/>
+          <w:sz w:val="18"/>
+        </w:rPr>
+        <w:t xml:space="preserve"> </w:t>
       </w:r>
     </w:p>
     <w:p>
@@ -8935,9 +9061,77 @@
       </w:pPr>
       <w:r>
         <w:rPr>
+          <w:noProof/>
           <w:sz w:val="18"/>
         </w:rPr>
+        <w:drawing>
+          <wp:anchor distT="0" distB="0" distL="114300" distR="114300" simplePos="0" relativeHeight="251800576" behindDoc="0" locked="0" layoutInCell="1" allowOverlap="1" wp14:anchorId="18EC0AC8" wp14:editId="38937F41">
+            <wp:simplePos x="0" y="0"/>
+            <wp:positionH relativeFrom="column">
+              <wp:posOffset>248420</wp:posOffset>
+            </wp:positionH>
+            <wp:positionV relativeFrom="paragraph">
+              <wp:posOffset>57506</wp:posOffset>
+            </wp:positionV>
+            <wp:extent cx="64770" cy="64770"/>
+            <wp:effectExtent l="0" t="0" r="0" b="0"/>
+            <wp:wrapNone/>
+            <wp:docPr id="1052075215" name="Graphic 1" descr="Checkmark with solid fill"/>
+            <wp:cNvGraphicFramePr>
+              <a:graphicFrameLocks xmlns:a="http://schemas.openxmlformats.org/drawingml/2006/main" noChangeAspect="1"/>
+            </wp:cNvGraphicFramePr>
+            <a:graphic xmlns:a="http://schemas.openxmlformats.org/drawingml/2006/main">
+              <a:graphicData uri="http://schemas.openxmlformats.org/drawingml/2006/picture">
+                <pic:pic xmlns:pic="http://schemas.openxmlformats.org/drawingml/2006/picture">
+                  <pic:nvPicPr>
+                    <pic:cNvPr id="1580647732" name="Graphic 1580647732" descr="Checkmark with solid fill"/>
+                    <pic:cNvPicPr/>
+                  </pic:nvPicPr>
+                  <pic:blipFill>
+                    <a:blip r:embed="rId8">
+                      <a:extLst>
+                        <a:ext uri="{96DAC541-7B7A-43D3-8B79-37D633B846F1}">
+                          <asvg:svgBlip xmlns:asvg="http://schemas.microsoft.com/office/drawing/2016/SVG/main" r:embed="rId9"/>
+                        </a:ext>
+                      </a:extLst>
+                    </a:blip>
+                    <a:stretch>
+                      <a:fillRect/>
+                    </a:stretch>
+                  </pic:blipFill>
+                  <pic:spPr>
+                    <a:xfrm>
+                      <a:off x="0" y="0"/>
+                      <a:ext cx="64770" cy="64770"/>
+                    </a:xfrm>
+                    <a:prstGeom prst="rect">
+                      <a:avLst/>
+                    </a:prstGeom>
+                  </pic:spPr>
+                </pic:pic>
+              </a:graphicData>
+            </a:graphic>
+            <wp14:sizeRelH relativeFrom="margin">
+              <wp14:pctWidth>0</wp14:pctWidth>
+            </wp14:sizeRelH>
+            <wp14:sizeRelV relativeFrom="margin">
+              <wp14:pctHeight>0</wp14:pctHeight>
+            </wp14:sizeRelV>
+          </wp:anchor>
+        </w:drawing>
+      </w:r>
+      <w:r>
+        <w:rPr>
+          <w:sz w:val="18"/>
+        </w:rPr>
         <w:t>☐ Add the project files.</w:t>
+      </w:r>
+      <w:r>
+        <w:rPr>
+          <w:noProof/>
+          <w:sz w:val="18"/>
+        </w:rPr>
+        <w:t xml:space="preserve"> </w:t>
       </w:r>
     </w:p>
     <w:p>
@@ -8951,9 +9145,77 @@
       </w:pPr>
       <w:r>
         <w:rPr>
+          <w:noProof/>
           <w:sz w:val="18"/>
         </w:rPr>
+        <w:drawing>
+          <wp:anchor distT="0" distB="0" distL="114300" distR="114300" simplePos="0" relativeHeight="251802624" behindDoc="0" locked="0" layoutInCell="1" allowOverlap="1" wp14:anchorId="0B588982" wp14:editId="0A5CB880">
+            <wp:simplePos x="0" y="0"/>
+            <wp:positionH relativeFrom="column">
+              <wp:posOffset>248421</wp:posOffset>
+            </wp:positionH>
+            <wp:positionV relativeFrom="paragraph">
+              <wp:posOffset>47570</wp:posOffset>
+            </wp:positionV>
+            <wp:extent cx="64770" cy="64770"/>
+            <wp:effectExtent l="0" t="0" r="0" b="0"/>
+            <wp:wrapNone/>
+            <wp:docPr id="2041843787" name="Graphic 1" descr="Checkmark with solid fill"/>
+            <wp:cNvGraphicFramePr>
+              <a:graphicFrameLocks xmlns:a="http://schemas.openxmlformats.org/drawingml/2006/main" noChangeAspect="1"/>
+            </wp:cNvGraphicFramePr>
+            <a:graphic xmlns:a="http://schemas.openxmlformats.org/drawingml/2006/main">
+              <a:graphicData uri="http://schemas.openxmlformats.org/drawingml/2006/picture">
+                <pic:pic xmlns:pic="http://schemas.openxmlformats.org/drawingml/2006/picture">
+                  <pic:nvPicPr>
+                    <pic:cNvPr id="1580647732" name="Graphic 1580647732" descr="Checkmark with solid fill"/>
+                    <pic:cNvPicPr/>
+                  </pic:nvPicPr>
+                  <pic:blipFill>
+                    <a:blip r:embed="rId8">
+                      <a:extLst>
+                        <a:ext uri="{96DAC541-7B7A-43D3-8B79-37D633B846F1}">
+                          <asvg:svgBlip xmlns:asvg="http://schemas.microsoft.com/office/drawing/2016/SVG/main" r:embed="rId9"/>
+                        </a:ext>
+                      </a:extLst>
+                    </a:blip>
+                    <a:stretch>
+                      <a:fillRect/>
+                    </a:stretch>
+                  </pic:blipFill>
+                  <pic:spPr>
+                    <a:xfrm>
+                      <a:off x="0" y="0"/>
+                      <a:ext cx="64770" cy="64770"/>
+                    </a:xfrm>
+                    <a:prstGeom prst="rect">
+                      <a:avLst/>
+                    </a:prstGeom>
+                  </pic:spPr>
+                </pic:pic>
+              </a:graphicData>
+            </a:graphic>
+            <wp14:sizeRelH relativeFrom="margin">
+              <wp14:pctWidth>0</wp14:pctWidth>
+            </wp14:sizeRelH>
+            <wp14:sizeRelV relativeFrom="margin">
+              <wp14:pctHeight>0</wp14:pctHeight>
+            </wp14:sizeRelV>
+          </wp:anchor>
+        </w:drawing>
+      </w:r>
+      <w:r>
+        <w:rPr>
+          <w:sz w:val="18"/>
+        </w:rPr>
         <w:t>☐ Create at least three meaningful commits.</w:t>
+      </w:r>
+      <w:r>
+        <w:rPr>
+          <w:noProof/>
+          <w:sz w:val="18"/>
+        </w:rPr>
+        <w:t xml:space="preserve"> </w:t>
       </w:r>
     </w:p>
     <w:p>
@@ -8967,9 +9229,77 @@
       </w:pPr>
       <w:r>
         <w:rPr>
+          <w:noProof/>
           <w:sz w:val="18"/>
         </w:rPr>
+        <w:drawing>
+          <wp:anchor distT="0" distB="0" distL="114300" distR="114300" simplePos="0" relativeHeight="251804672" behindDoc="0" locked="0" layoutInCell="1" allowOverlap="1" wp14:anchorId="1535B0C4" wp14:editId="7EA5DB0F">
+            <wp:simplePos x="0" y="0"/>
+            <wp:positionH relativeFrom="column">
+              <wp:posOffset>243135</wp:posOffset>
+            </wp:positionH>
+            <wp:positionV relativeFrom="paragraph">
+              <wp:posOffset>57507</wp:posOffset>
+            </wp:positionV>
+            <wp:extent cx="64770" cy="64770"/>
+            <wp:effectExtent l="0" t="0" r="0" b="0"/>
+            <wp:wrapNone/>
+            <wp:docPr id="1450123123" name="Graphic 1" descr="Checkmark with solid fill"/>
+            <wp:cNvGraphicFramePr>
+              <a:graphicFrameLocks xmlns:a="http://schemas.openxmlformats.org/drawingml/2006/main" noChangeAspect="1"/>
+            </wp:cNvGraphicFramePr>
+            <a:graphic xmlns:a="http://schemas.openxmlformats.org/drawingml/2006/main">
+              <a:graphicData uri="http://schemas.openxmlformats.org/drawingml/2006/picture">
+                <pic:pic xmlns:pic="http://schemas.openxmlformats.org/drawingml/2006/picture">
+                  <pic:nvPicPr>
+                    <pic:cNvPr id="1580647732" name="Graphic 1580647732" descr="Checkmark with solid fill"/>
+                    <pic:cNvPicPr/>
+                  </pic:nvPicPr>
+                  <pic:blipFill>
+                    <a:blip r:embed="rId8">
+                      <a:extLst>
+                        <a:ext uri="{96DAC541-7B7A-43D3-8B79-37D633B846F1}">
+                          <asvg:svgBlip xmlns:asvg="http://schemas.microsoft.com/office/drawing/2016/SVG/main" r:embed="rId9"/>
+                        </a:ext>
+                      </a:extLst>
+                    </a:blip>
+                    <a:stretch>
+                      <a:fillRect/>
+                    </a:stretch>
+                  </pic:blipFill>
+                  <pic:spPr>
+                    <a:xfrm>
+                      <a:off x="0" y="0"/>
+                      <a:ext cx="64770" cy="64770"/>
+                    </a:xfrm>
+                    <a:prstGeom prst="rect">
+                      <a:avLst/>
+                    </a:prstGeom>
+                  </pic:spPr>
+                </pic:pic>
+              </a:graphicData>
+            </a:graphic>
+            <wp14:sizeRelH relativeFrom="margin">
+              <wp14:pctWidth>0</wp14:pctWidth>
+            </wp14:sizeRelH>
+            <wp14:sizeRelV relativeFrom="margin">
+              <wp14:pctHeight>0</wp14:pctHeight>
+            </wp14:sizeRelV>
+          </wp:anchor>
+        </w:drawing>
+      </w:r>
+      <w:r>
+        <w:rPr>
+          <w:sz w:val="18"/>
+        </w:rPr>
         <w:t>☐ Create a branch and make one change.</w:t>
+      </w:r>
+      <w:r>
+        <w:rPr>
+          <w:noProof/>
+          <w:sz w:val="18"/>
+        </w:rPr>
+        <w:t xml:space="preserve"> </w:t>
       </w:r>
     </w:p>
     <w:p>
@@ -8983,9 +9313,77 @@
       </w:pPr>
       <w:r>
         <w:rPr>
+          <w:noProof/>
           <w:sz w:val="18"/>
         </w:rPr>
+        <w:drawing>
+          <wp:anchor distT="0" distB="0" distL="114300" distR="114300" simplePos="0" relativeHeight="251806720" behindDoc="0" locked="0" layoutInCell="1" allowOverlap="1" wp14:anchorId="5DACBBE6" wp14:editId="6376F73B">
+            <wp:simplePos x="0" y="0"/>
+            <wp:positionH relativeFrom="column">
+              <wp:posOffset>248421</wp:posOffset>
+            </wp:positionH>
+            <wp:positionV relativeFrom="paragraph">
+              <wp:posOffset>42284</wp:posOffset>
+            </wp:positionV>
+            <wp:extent cx="64770" cy="64770"/>
+            <wp:effectExtent l="0" t="0" r="0" b="0"/>
+            <wp:wrapNone/>
+            <wp:docPr id="1486208760" name="Graphic 1" descr="Checkmark with solid fill"/>
+            <wp:cNvGraphicFramePr>
+              <a:graphicFrameLocks xmlns:a="http://schemas.openxmlformats.org/drawingml/2006/main" noChangeAspect="1"/>
+            </wp:cNvGraphicFramePr>
+            <a:graphic xmlns:a="http://schemas.openxmlformats.org/drawingml/2006/main">
+              <a:graphicData uri="http://schemas.openxmlformats.org/drawingml/2006/picture">
+                <pic:pic xmlns:pic="http://schemas.openxmlformats.org/drawingml/2006/picture">
+                  <pic:nvPicPr>
+                    <pic:cNvPr id="1580647732" name="Graphic 1580647732" descr="Checkmark with solid fill"/>
+                    <pic:cNvPicPr/>
+                  </pic:nvPicPr>
+                  <pic:blipFill>
+                    <a:blip r:embed="rId8">
+                      <a:extLst>
+                        <a:ext uri="{96DAC541-7B7A-43D3-8B79-37D633B846F1}">
+                          <asvg:svgBlip xmlns:asvg="http://schemas.microsoft.com/office/drawing/2016/SVG/main" r:embed="rId9"/>
+                        </a:ext>
+                      </a:extLst>
+                    </a:blip>
+                    <a:stretch>
+                      <a:fillRect/>
+                    </a:stretch>
+                  </pic:blipFill>
+                  <pic:spPr>
+                    <a:xfrm>
+                      <a:off x="0" y="0"/>
+                      <a:ext cx="64770" cy="64770"/>
+                    </a:xfrm>
+                    <a:prstGeom prst="rect">
+                      <a:avLst/>
+                    </a:prstGeom>
+                  </pic:spPr>
+                </pic:pic>
+              </a:graphicData>
+            </a:graphic>
+            <wp14:sizeRelH relativeFrom="margin">
+              <wp14:pctWidth>0</wp14:pctWidth>
+            </wp14:sizeRelH>
+            <wp14:sizeRelV relativeFrom="margin">
+              <wp14:pctHeight>0</wp14:pctHeight>
+            </wp14:sizeRelV>
+          </wp:anchor>
+        </w:drawing>
+      </w:r>
+      <w:r>
+        <w:rPr>
+          <w:sz w:val="18"/>
+        </w:rPr>
         <w:t>☐ Push the branch and open a basic pull request, where required.</w:t>
+      </w:r>
+      <w:r>
+        <w:rPr>
+          <w:noProof/>
+          <w:sz w:val="18"/>
+        </w:rPr>
+        <w:t xml:space="preserve"> </w:t>
       </w:r>
     </w:p>
     <w:p>
@@ -8999,6 +9397,67 @@
       </w:pPr>
       <w:r>
         <w:rPr>
+          <w:noProof/>
+          <w:sz w:val="18"/>
+        </w:rPr>
+        <w:drawing>
+          <wp:anchor distT="0" distB="0" distL="114300" distR="114300" simplePos="0" relativeHeight="251808768" behindDoc="0" locked="0" layoutInCell="1" allowOverlap="1" wp14:anchorId="47D3B40F" wp14:editId="1C7BEAD3">
+            <wp:simplePos x="0" y="0"/>
+            <wp:positionH relativeFrom="column">
+              <wp:posOffset>243135</wp:posOffset>
+            </wp:positionH>
+            <wp:positionV relativeFrom="paragraph">
+              <wp:posOffset>52220</wp:posOffset>
+            </wp:positionV>
+            <wp:extent cx="64770" cy="64770"/>
+            <wp:effectExtent l="0" t="0" r="0" b="0"/>
+            <wp:wrapNone/>
+            <wp:docPr id="996319912" name="Graphic 1" descr="Checkmark with solid fill"/>
+            <wp:cNvGraphicFramePr>
+              <a:graphicFrameLocks xmlns:a="http://schemas.openxmlformats.org/drawingml/2006/main" noChangeAspect="1"/>
+            </wp:cNvGraphicFramePr>
+            <a:graphic xmlns:a="http://schemas.openxmlformats.org/drawingml/2006/main">
+              <a:graphicData uri="http://schemas.openxmlformats.org/drawingml/2006/picture">
+                <pic:pic xmlns:pic="http://schemas.openxmlformats.org/drawingml/2006/picture">
+                  <pic:nvPicPr>
+                    <pic:cNvPr id="1580647732" name="Graphic 1580647732" descr="Checkmark with solid fill"/>
+                    <pic:cNvPicPr/>
+                  </pic:nvPicPr>
+                  <pic:blipFill>
+                    <a:blip r:embed="rId8">
+                      <a:extLst>
+                        <a:ext uri="{96DAC541-7B7A-43D3-8B79-37D633B846F1}">
+                          <asvg:svgBlip xmlns:asvg="http://schemas.microsoft.com/office/drawing/2016/SVG/main" r:embed="rId9"/>
+                        </a:ext>
+                      </a:extLst>
+                    </a:blip>
+                    <a:stretch>
+                      <a:fillRect/>
+                    </a:stretch>
+                  </pic:blipFill>
+                  <pic:spPr>
+                    <a:xfrm>
+                      <a:off x="0" y="0"/>
+                      <a:ext cx="64770" cy="64770"/>
+                    </a:xfrm>
+                    <a:prstGeom prst="rect">
+                      <a:avLst/>
+                    </a:prstGeom>
+                  </pic:spPr>
+                </pic:pic>
+              </a:graphicData>
+            </a:graphic>
+            <wp14:sizeRelH relativeFrom="margin">
+              <wp14:pctWidth>0</wp14:pctWidth>
+            </wp14:sizeRelH>
+            <wp14:sizeRelV relativeFrom="margin">
+              <wp14:pctHeight>0</wp14:pctHeight>
+            </wp14:sizeRelV>
+          </wp:anchor>
+        </w:drawing>
+      </w:r>
+      <w:r>
+        <w:rPr>
           <w:sz w:val="18"/>
         </w:rPr>
         <w:t xml:space="preserve">☐ Use clear commit messages. </w:t>
@@ -9023,9 +9482,77 @@
       </w:pPr>
       <w:r>
         <w:rPr>
+          <w:noProof/>
           <w:sz w:val="18"/>
         </w:rPr>
+        <w:drawing>
+          <wp:anchor distT="0" distB="0" distL="114300" distR="114300" simplePos="0" relativeHeight="251810816" behindDoc="0" locked="0" layoutInCell="1" allowOverlap="1" wp14:anchorId="5D96A973" wp14:editId="76C64CFB">
+            <wp:simplePos x="0" y="0"/>
+            <wp:positionH relativeFrom="column">
+              <wp:posOffset>248421</wp:posOffset>
+            </wp:positionH>
+            <wp:positionV relativeFrom="paragraph">
+              <wp:posOffset>47570</wp:posOffset>
+            </wp:positionV>
+            <wp:extent cx="64770" cy="64770"/>
+            <wp:effectExtent l="0" t="0" r="0" b="0"/>
+            <wp:wrapNone/>
+            <wp:docPr id="1118755405" name="Graphic 1" descr="Checkmark with solid fill"/>
+            <wp:cNvGraphicFramePr>
+              <a:graphicFrameLocks xmlns:a="http://schemas.openxmlformats.org/drawingml/2006/main" noChangeAspect="1"/>
+            </wp:cNvGraphicFramePr>
+            <a:graphic xmlns:a="http://schemas.openxmlformats.org/drawingml/2006/main">
+              <a:graphicData uri="http://schemas.openxmlformats.org/drawingml/2006/picture">
+                <pic:pic xmlns:pic="http://schemas.openxmlformats.org/drawingml/2006/picture">
+                  <pic:nvPicPr>
+                    <pic:cNvPr id="1580647732" name="Graphic 1580647732" descr="Checkmark with solid fill"/>
+                    <pic:cNvPicPr/>
+                  </pic:nvPicPr>
+                  <pic:blipFill>
+                    <a:blip r:embed="rId8">
+                      <a:extLst>
+                        <a:ext uri="{96DAC541-7B7A-43D3-8B79-37D633B846F1}">
+                          <asvg:svgBlip xmlns:asvg="http://schemas.microsoft.com/office/drawing/2016/SVG/main" r:embed="rId9"/>
+                        </a:ext>
+                      </a:extLst>
+                    </a:blip>
+                    <a:stretch>
+                      <a:fillRect/>
+                    </a:stretch>
+                  </pic:blipFill>
+                  <pic:spPr>
+                    <a:xfrm>
+                      <a:off x="0" y="0"/>
+                      <a:ext cx="64770" cy="64770"/>
+                    </a:xfrm>
+                    <a:prstGeom prst="rect">
+                      <a:avLst/>
+                    </a:prstGeom>
+                  </pic:spPr>
+                </pic:pic>
+              </a:graphicData>
+            </a:graphic>
+            <wp14:sizeRelH relativeFrom="margin">
+              <wp14:pctWidth>0</wp14:pctWidth>
+            </wp14:sizeRelH>
+            <wp14:sizeRelV relativeFrom="margin">
+              <wp14:pctHeight>0</wp14:pctHeight>
+            </wp14:sizeRelV>
+          </wp:anchor>
+        </w:drawing>
+      </w:r>
+      <w:r>
+        <w:rPr>
+          <w:sz w:val="18"/>
+        </w:rPr>
         <w:t>☐ Repository link.</w:t>
+      </w:r>
+      <w:r>
+        <w:rPr>
+          <w:noProof/>
+          <w:sz w:val="18"/>
+        </w:rPr>
+        <w:t xml:space="preserve"> </w:t>
       </w:r>
     </w:p>
     <w:p>
@@ -9039,9 +9566,77 @@
       </w:pPr>
       <w:r>
         <w:rPr>
+          <w:noProof/>
           <w:sz w:val="18"/>
         </w:rPr>
+        <w:drawing>
+          <wp:anchor distT="0" distB="0" distL="114300" distR="114300" simplePos="0" relativeHeight="251812864" behindDoc="0" locked="0" layoutInCell="1" allowOverlap="1" wp14:anchorId="03410C0E" wp14:editId="0F208049">
+            <wp:simplePos x="0" y="0"/>
+            <wp:positionH relativeFrom="column">
+              <wp:posOffset>248421</wp:posOffset>
+            </wp:positionH>
+            <wp:positionV relativeFrom="paragraph">
+              <wp:posOffset>64135</wp:posOffset>
+            </wp:positionV>
+            <wp:extent cx="64770" cy="64770"/>
+            <wp:effectExtent l="0" t="0" r="0" b="0"/>
+            <wp:wrapNone/>
+            <wp:docPr id="322304336" name="Graphic 1" descr="Checkmark with solid fill"/>
+            <wp:cNvGraphicFramePr>
+              <a:graphicFrameLocks xmlns:a="http://schemas.openxmlformats.org/drawingml/2006/main" noChangeAspect="1"/>
+            </wp:cNvGraphicFramePr>
+            <a:graphic xmlns:a="http://schemas.openxmlformats.org/drawingml/2006/main">
+              <a:graphicData uri="http://schemas.openxmlformats.org/drawingml/2006/picture">
+                <pic:pic xmlns:pic="http://schemas.openxmlformats.org/drawingml/2006/picture">
+                  <pic:nvPicPr>
+                    <pic:cNvPr id="1580647732" name="Graphic 1580647732" descr="Checkmark with solid fill"/>
+                    <pic:cNvPicPr/>
+                  </pic:nvPicPr>
+                  <pic:blipFill>
+                    <a:blip r:embed="rId8">
+                      <a:extLst>
+                        <a:ext uri="{96DAC541-7B7A-43D3-8B79-37D633B846F1}">
+                          <asvg:svgBlip xmlns:asvg="http://schemas.microsoft.com/office/drawing/2016/SVG/main" r:embed="rId9"/>
+                        </a:ext>
+                      </a:extLst>
+                    </a:blip>
+                    <a:stretch>
+                      <a:fillRect/>
+                    </a:stretch>
+                  </pic:blipFill>
+                  <pic:spPr>
+                    <a:xfrm>
+                      <a:off x="0" y="0"/>
+                      <a:ext cx="64770" cy="64770"/>
+                    </a:xfrm>
+                    <a:prstGeom prst="rect">
+                      <a:avLst/>
+                    </a:prstGeom>
+                  </pic:spPr>
+                </pic:pic>
+              </a:graphicData>
+            </a:graphic>
+            <wp14:sizeRelH relativeFrom="margin">
+              <wp14:pctWidth>0</wp14:pctWidth>
+            </wp14:sizeRelH>
+            <wp14:sizeRelV relativeFrom="margin">
+              <wp14:pctHeight>0</wp14:pctHeight>
+            </wp14:sizeRelV>
+          </wp:anchor>
+        </w:drawing>
+      </w:r>
+      <w:r>
+        <w:rPr>
+          <w:sz w:val="18"/>
+        </w:rPr>
         <w:t>☐ Screenshot of commit history.</w:t>
+      </w:r>
+      <w:r>
+        <w:rPr>
+          <w:noProof/>
+          <w:sz w:val="18"/>
+        </w:rPr>
+        <w:t xml:space="preserve"> </w:t>
       </w:r>
     </w:p>
     <w:p>
@@ -9055,9 +9650,77 @@
       </w:pPr>
       <w:r>
         <w:rPr>
+          <w:noProof/>
           <w:sz w:val="18"/>
         </w:rPr>
+        <w:drawing>
+          <wp:anchor distT="0" distB="0" distL="114300" distR="114300" simplePos="0" relativeHeight="251814912" behindDoc="0" locked="0" layoutInCell="1" allowOverlap="1" wp14:anchorId="1A4A8A4F" wp14:editId="28DAFCFC">
+            <wp:simplePos x="0" y="0"/>
+            <wp:positionH relativeFrom="column">
+              <wp:posOffset>248421</wp:posOffset>
+            </wp:positionH>
+            <wp:positionV relativeFrom="paragraph">
+              <wp:posOffset>52855</wp:posOffset>
+            </wp:positionV>
+            <wp:extent cx="64770" cy="64770"/>
+            <wp:effectExtent l="0" t="0" r="0" b="0"/>
+            <wp:wrapNone/>
+            <wp:docPr id="412661049" name="Graphic 1" descr="Checkmark with solid fill"/>
+            <wp:cNvGraphicFramePr>
+              <a:graphicFrameLocks xmlns:a="http://schemas.openxmlformats.org/drawingml/2006/main" noChangeAspect="1"/>
+            </wp:cNvGraphicFramePr>
+            <a:graphic xmlns:a="http://schemas.openxmlformats.org/drawingml/2006/main">
+              <a:graphicData uri="http://schemas.openxmlformats.org/drawingml/2006/picture">
+                <pic:pic xmlns:pic="http://schemas.openxmlformats.org/drawingml/2006/picture">
+                  <pic:nvPicPr>
+                    <pic:cNvPr id="1580647732" name="Graphic 1580647732" descr="Checkmark with solid fill"/>
+                    <pic:cNvPicPr/>
+                  </pic:nvPicPr>
+                  <pic:blipFill>
+                    <a:blip r:embed="rId8">
+                      <a:extLst>
+                        <a:ext uri="{96DAC541-7B7A-43D3-8B79-37D633B846F1}">
+                          <asvg:svgBlip xmlns:asvg="http://schemas.microsoft.com/office/drawing/2016/SVG/main" r:embed="rId9"/>
+                        </a:ext>
+                      </a:extLst>
+                    </a:blip>
+                    <a:stretch>
+                      <a:fillRect/>
+                    </a:stretch>
+                  </pic:blipFill>
+                  <pic:spPr>
+                    <a:xfrm>
+                      <a:off x="0" y="0"/>
+                      <a:ext cx="64770" cy="64770"/>
+                    </a:xfrm>
+                    <a:prstGeom prst="rect">
+                      <a:avLst/>
+                    </a:prstGeom>
+                  </pic:spPr>
+                </pic:pic>
+              </a:graphicData>
+            </a:graphic>
+            <wp14:sizeRelH relativeFrom="margin">
+              <wp14:pctWidth>0</wp14:pctWidth>
+            </wp14:sizeRelH>
+            <wp14:sizeRelV relativeFrom="margin">
+              <wp14:pctHeight>0</wp14:pctHeight>
+            </wp14:sizeRelV>
+          </wp:anchor>
+        </w:drawing>
+      </w:r>
+      <w:r>
+        <w:rPr>
+          <w:sz w:val="18"/>
+        </w:rPr>
         <w:t>☐ Screenshot of branch or pull request.</w:t>
+      </w:r>
+      <w:r>
+        <w:rPr>
+          <w:noProof/>
+          <w:sz w:val="18"/>
+        </w:rPr>
+        <w:t xml:space="preserve"> </w:t>
       </w:r>
     </w:p>
     <w:p>
@@ -9071,6 +9734,67 @@
       </w:pPr>
       <w:r>
         <w:rPr>
+          <w:noProof/>
+          <w:sz w:val="18"/>
+        </w:rPr>
+        <w:drawing>
+          <wp:anchor distT="0" distB="0" distL="114300" distR="114300" simplePos="0" relativeHeight="251816960" behindDoc="0" locked="0" layoutInCell="1" allowOverlap="1" wp14:anchorId="31F4BA53" wp14:editId="7EF5BD7A">
+            <wp:simplePos x="0" y="0"/>
+            <wp:positionH relativeFrom="column">
+              <wp:posOffset>248421</wp:posOffset>
+            </wp:positionH>
+            <wp:positionV relativeFrom="paragraph">
+              <wp:posOffset>52220</wp:posOffset>
+            </wp:positionV>
+            <wp:extent cx="64770" cy="64770"/>
+            <wp:effectExtent l="0" t="0" r="0" b="0"/>
+            <wp:wrapNone/>
+            <wp:docPr id="1414107082" name="Graphic 1" descr="Checkmark with solid fill"/>
+            <wp:cNvGraphicFramePr>
+              <a:graphicFrameLocks xmlns:a="http://schemas.openxmlformats.org/drawingml/2006/main" noChangeAspect="1"/>
+            </wp:cNvGraphicFramePr>
+            <a:graphic xmlns:a="http://schemas.openxmlformats.org/drawingml/2006/main">
+              <a:graphicData uri="http://schemas.openxmlformats.org/drawingml/2006/picture">
+                <pic:pic xmlns:pic="http://schemas.openxmlformats.org/drawingml/2006/picture">
+                  <pic:nvPicPr>
+                    <pic:cNvPr id="1580647732" name="Graphic 1580647732" descr="Checkmark with solid fill"/>
+                    <pic:cNvPicPr/>
+                  </pic:nvPicPr>
+                  <pic:blipFill>
+                    <a:blip r:embed="rId8">
+                      <a:extLst>
+                        <a:ext uri="{96DAC541-7B7A-43D3-8B79-37D633B846F1}">
+                          <asvg:svgBlip xmlns:asvg="http://schemas.microsoft.com/office/drawing/2016/SVG/main" r:embed="rId9"/>
+                        </a:ext>
+                      </a:extLst>
+                    </a:blip>
+                    <a:stretch>
+                      <a:fillRect/>
+                    </a:stretch>
+                  </pic:blipFill>
+                  <pic:spPr>
+                    <a:xfrm>
+                      <a:off x="0" y="0"/>
+                      <a:ext cx="64770" cy="64770"/>
+                    </a:xfrm>
+                    <a:prstGeom prst="rect">
+                      <a:avLst/>
+                    </a:prstGeom>
+                  </pic:spPr>
+                </pic:pic>
+              </a:graphicData>
+            </a:graphic>
+            <wp14:sizeRelH relativeFrom="margin">
+              <wp14:pctWidth>0</wp14:pctWidth>
+            </wp14:sizeRelH>
+            <wp14:sizeRelV relativeFrom="margin">
+              <wp14:pctHeight>0</wp14:pctHeight>
+            </wp14:sizeRelV>
+          </wp:anchor>
+        </w:drawing>
+      </w:r>
+      <w:r>
+        <w:rPr>
           <w:sz w:val="18"/>
         </w:rPr>
         <w:t xml:space="preserve">☐ README or project description. </w:t>
@@ -9095,9 +9819,77 @@
       </w:pPr>
       <w:r>
         <w:rPr>
+          <w:noProof/>
           <w:sz w:val="18"/>
         </w:rPr>
+        <w:drawing>
+          <wp:anchor distT="0" distB="0" distL="114300" distR="114300" simplePos="0" relativeHeight="251819008" behindDoc="0" locked="0" layoutInCell="1" allowOverlap="1" wp14:anchorId="2B8132E6" wp14:editId="2F114E4B">
+            <wp:simplePos x="0" y="0"/>
+            <wp:positionH relativeFrom="column">
+              <wp:posOffset>248421</wp:posOffset>
+            </wp:positionH>
+            <wp:positionV relativeFrom="paragraph">
+              <wp:posOffset>57506</wp:posOffset>
+            </wp:positionV>
+            <wp:extent cx="64770" cy="64770"/>
+            <wp:effectExtent l="0" t="0" r="0" b="0"/>
+            <wp:wrapNone/>
+            <wp:docPr id="82513898" name="Graphic 1" descr="Checkmark with solid fill"/>
+            <wp:cNvGraphicFramePr>
+              <a:graphicFrameLocks xmlns:a="http://schemas.openxmlformats.org/drawingml/2006/main" noChangeAspect="1"/>
+            </wp:cNvGraphicFramePr>
+            <a:graphic xmlns:a="http://schemas.openxmlformats.org/drawingml/2006/main">
+              <a:graphicData uri="http://schemas.openxmlformats.org/drawingml/2006/picture">
+                <pic:pic xmlns:pic="http://schemas.openxmlformats.org/drawingml/2006/picture">
+                  <pic:nvPicPr>
+                    <pic:cNvPr id="1580647732" name="Graphic 1580647732" descr="Checkmark with solid fill"/>
+                    <pic:cNvPicPr/>
+                  </pic:nvPicPr>
+                  <pic:blipFill>
+                    <a:blip r:embed="rId8">
+                      <a:extLst>
+                        <a:ext uri="{96DAC541-7B7A-43D3-8B79-37D633B846F1}">
+                          <asvg:svgBlip xmlns:asvg="http://schemas.microsoft.com/office/drawing/2016/SVG/main" r:embed="rId9"/>
+                        </a:ext>
+                      </a:extLst>
+                    </a:blip>
+                    <a:stretch>
+                      <a:fillRect/>
+                    </a:stretch>
+                  </pic:blipFill>
+                  <pic:spPr>
+                    <a:xfrm>
+                      <a:off x="0" y="0"/>
+                      <a:ext cx="64770" cy="64770"/>
+                    </a:xfrm>
+                    <a:prstGeom prst="rect">
+                      <a:avLst/>
+                    </a:prstGeom>
+                  </pic:spPr>
+                </pic:pic>
+              </a:graphicData>
+            </a:graphic>
+            <wp14:sizeRelH relativeFrom="margin">
+              <wp14:pctWidth>0</wp14:pctWidth>
+            </wp14:sizeRelH>
+            <wp14:sizeRelV relativeFrom="margin">
+              <wp14:pctHeight>0</wp14:pctHeight>
+            </wp14:sizeRelV>
+          </wp:anchor>
+        </w:drawing>
+      </w:r>
+      <w:r>
+        <w:rPr>
+          <w:sz w:val="18"/>
+        </w:rPr>
         <w:t>☐ Repository contains correct files.</w:t>
+      </w:r>
+      <w:r>
+        <w:rPr>
+          <w:noProof/>
+          <w:sz w:val="18"/>
+        </w:rPr>
+        <w:t xml:space="preserve"> </w:t>
       </w:r>
     </w:p>
     <w:p>
@@ -9111,9 +9903,77 @@
       </w:pPr>
       <w:r>
         <w:rPr>
+          <w:noProof/>
           <w:sz w:val="18"/>
         </w:rPr>
+        <w:drawing>
+          <wp:anchor distT="0" distB="0" distL="114300" distR="114300" simplePos="0" relativeHeight="251821056" behindDoc="0" locked="0" layoutInCell="1" allowOverlap="1" wp14:anchorId="74A88EA5" wp14:editId="0F5EDC73">
+            <wp:simplePos x="0" y="0"/>
+            <wp:positionH relativeFrom="column">
+              <wp:posOffset>248421</wp:posOffset>
+            </wp:positionH>
+            <wp:positionV relativeFrom="paragraph">
+              <wp:posOffset>57506</wp:posOffset>
+            </wp:positionV>
+            <wp:extent cx="64770" cy="64770"/>
+            <wp:effectExtent l="0" t="0" r="0" b="0"/>
+            <wp:wrapNone/>
+            <wp:docPr id="972353855" name="Graphic 1" descr="Checkmark with solid fill"/>
+            <wp:cNvGraphicFramePr>
+              <a:graphicFrameLocks xmlns:a="http://schemas.openxmlformats.org/drawingml/2006/main" noChangeAspect="1"/>
+            </wp:cNvGraphicFramePr>
+            <a:graphic xmlns:a="http://schemas.openxmlformats.org/drawingml/2006/main">
+              <a:graphicData uri="http://schemas.openxmlformats.org/drawingml/2006/picture">
+                <pic:pic xmlns:pic="http://schemas.openxmlformats.org/drawingml/2006/picture">
+                  <pic:nvPicPr>
+                    <pic:cNvPr id="1580647732" name="Graphic 1580647732" descr="Checkmark with solid fill"/>
+                    <pic:cNvPicPr/>
+                  </pic:nvPicPr>
+                  <pic:blipFill>
+                    <a:blip r:embed="rId8">
+                      <a:extLst>
+                        <a:ext uri="{96DAC541-7B7A-43D3-8B79-37D633B846F1}">
+                          <asvg:svgBlip xmlns:asvg="http://schemas.microsoft.com/office/drawing/2016/SVG/main" r:embed="rId9"/>
+                        </a:ext>
+                      </a:extLst>
+                    </a:blip>
+                    <a:stretch>
+                      <a:fillRect/>
+                    </a:stretch>
+                  </pic:blipFill>
+                  <pic:spPr>
+                    <a:xfrm>
+                      <a:off x="0" y="0"/>
+                      <a:ext cx="64770" cy="64770"/>
+                    </a:xfrm>
+                    <a:prstGeom prst="rect">
+                      <a:avLst/>
+                    </a:prstGeom>
+                  </pic:spPr>
+                </pic:pic>
+              </a:graphicData>
+            </a:graphic>
+            <wp14:sizeRelH relativeFrom="margin">
+              <wp14:pctWidth>0</wp14:pctWidth>
+            </wp14:sizeRelH>
+            <wp14:sizeRelV relativeFrom="margin">
+              <wp14:pctHeight>0</wp14:pctHeight>
+            </wp14:sizeRelV>
+          </wp:anchor>
+        </w:drawing>
+      </w:r>
+      <w:r>
+        <w:rPr>
+          <w:sz w:val="18"/>
+        </w:rPr>
         <w:t>☐ Commit history shows progressive work.</w:t>
+      </w:r>
+      <w:r>
+        <w:rPr>
+          <w:noProof/>
+          <w:sz w:val="18"/>
+        </w:rPr>
+        <w:t xml:space="preserve"> </w:t>
       </w:r>
     </w:p>
     <w:p>
@@ -9127,9 +9987,77 @@
       </w:pPr>
       <w:r>
         <w:rPr>
+          <w:noProof/>
           <w:sz w:val="18"/>
         </w:rPr>
+        <w:drawing>
+          <wp:anchor distT="0" distB="0" distL="114300" distR="114300" simplePos="0" relativeHeight="251823104" behindDoc="0" locked="0" layoutInCell="1" allowOverlap="1" wp14:anchorId="0EA15539" wp14:editId="3CBAF815">
+            <wp:simplePos x="0" y="0"/>
+            <wp:positionH relativeFrom="column">
+              <wp:posOffset>243135</wp:posOffset>
+            </wp:positionH>
+            <wp:positionV relativeFrom="paragraph">
+              <wp:posOffset>52856</wp:posOffset>
+            </wp:positionV>
+            <wp:extent cx="64770" cy="64770"/>
+            <wp:effectExtent l="0" t="0" r="0" b="0"/>
+            <wp:wrapNone/>
+            <wp:docPr id="792983933" name="Graphic 1" descr="Checkmark with solid fill"/>
+            <wp:cNvGraphicFramePr>
+              <a:graphicFrameLocks xmlns:a="http://schemas.openxmlformats.org/drawingml/2006/main" noChangeAspect="1"/>
+            </wp:cNvGraphicFramePr>
+            <a:graphic xmlns:a="http://schemas.openxmlformats.org/drawingml/2006/main">
+              <a:graphicData uri="http://schemas.openxmlformats.org/drawingml/2006/picture">
+                <pic:pic xmlns:pic="http://schemas.openxmlformats.org/drawingml/2006/picture">
+                  <pic:nvPicPr>
+                    <pic:cNvPr id="1580647732" name="Graphic 1580647732" descr="Checkmark with solid fill"/>
+                    <pic:cNvPicPr/>
+                  </pic:nvPicPr>
+                  <pic:blipFill>
+                    <a:blip r:embed="rId8">
+                      <a:extLst>
+                        <a:ext uri="{96DAC541-7B7A-43D3-8B79-37D633B846F1}">
+                          <asvg:svgBlip xmlns:asvg="http://schemas.microsoft.com/office/drawing/2016/SVG/main" r:embed="rId9"/>
+                        </a:ext>
+                      </a:extLst>
+                    </a:blip>
+                    <a:stretch>
+                      <a:fillRect/>
+                    </a:stretch>
+                  </pic:blipFill>
+                  <pic:spPr>
+                    <a:xfrm>
+                      <a:off x="0" y="0"/>
+                      <a:ext cx="64770" cy="64770"/>
+                    </a:xfrm>
+                    <a:prstGeom prst="rect">
+                      <a:avLst/>
+                    </a:prstGeom>
+                  </pic:spPr>
+                </pic:pic>
+              </a:graphicData>
+            </a:graphic>
+            <wp14:sizeRelH relativeFrom="margin">
+              <wp14:pctWidth>0</wp14:pctWidth>
+            </wp14:sizeRelH>
+            <wp14:sizeRelV relativeFrom="margin">
+              <wp14:pctHeight>0</wp14:pctHeight>
+            </wp14:sizeRelV>
+          </wp:anchor>
+        </w:drawing>
+      </w:r>
+      <w:r>
+        <w:rPr>
+          <w:sz w:val="18"/>
+        </w:rPr>
         <w:t>☐ Branching evidence is present.</w:t>
+      </w:r>
+      <w:r>
+        <w:rPr>
+          <w:noProof/>
+          <w:sz w:val="18"/>
+        </w:rPr>
+        <w:t xml:space="preserve"> </w:t>
       </w:r>
     </w:p>
     <w:p>
@@ -9141,6 +10069,67 @@
         <w:spacing w:after="184"/>
         <w:ind w:hanging="360"/>
       </w:pPr>
+      <w:r>
+        <w:rPr>
+          <w:noProof/>
+          <w:sz w:val="18"/>
+        </w:rPr>
+        <w:drawing>
+          <wp:anchor distT="0" distB="0" distL="114300" distR="114300" simplePos="0" relativeHeight="251825152" behindDoc="0" locked="0" layoutInCell="1" allowOverlap="1" wp14:anchorId="53FB2D92" wp14:editId="146729F5">
+            <wp:simplePos x="0" y="0"/>
+            <wp:positionH relativeFrom="column">
+              <wp:posOffset>243135</wp:posOffset>
+            </wp:positionH>
+            <wp:positionV relativeFrom="paragraph">
+              <wp:posOffset>41000</wp:posOffset>
+            </wp:positionV>
+            <wp:extent cx="64770" cy="64770"/>
+            <wp:effectExtent l="0" t="0" r="0" b="0"/>
+            <wp:wrapNone/>
+            <wp:docPr id="1303585187" name="Graphic 1" descr="Checkmark with solid fill"/>
+            <wp:cNvGraphicFramePr>
+              <a:graphicFrameLocks xmlns:a="http://schemas.openxmlformats.org/drawingml/2006/main" noChangeAspect="1"/>
+            </wp:cNvGraphicFramePr>
+            <a:graphic xmlns:a="http://schemas.openxmlformats.org/drawingml/2006/main">
+              <a:graphicData uri="http://schemas.openxmlformats.org/drawingml/2006/picture">
+                <pic:pic xmlns:pic="http://schemas.openxmlformats.org/drawingml/2006/picture">
+                  <pic:nvPicPr>
+                    <pic:cNvPr id="1580647732" name="Graphic 1580647732" descr="Checkmark with solid fill"/>
+                    <pic:cNvPicPr/>
+                  </pic:nvPicPr>
+                  <pic:blipFill>
+                    <a:blip r:embed="rId8">
+                      <a:extLst>
+                        <a:ext uri="{96DAC541-7B7A-43D3-8B79-37D633B846F1}">
+                          <asvg:svgBlip xmlns:asvg="http://schemas.microsoft.com/office/drawing/2016/SVG/main" r:embed="rId9"/>
+                        </a:ext>
+                      </a:extLst>
+                    </a:blip>
+                    <a:stretch>
+                      <a:fillRect/>
+                    </a:stretch>
+                  </pic:blipFill>
+                  <pic:spPr>
+                    <a:xfrm>
+                      <a:off x="0" y="0"/>
+                      <a:ext cx="64770" cy="64770"/>
+                    </a:xfrm>
+                    <a:prstGeom prst="rect">
+                      <a:avLst/>
+                    </a:prstGeom>
+                  </pic:spPr>
+                </pic:pic>
+              </a:graphicData>
+            </a:graphic>
+            <wp14:sizeRelH relativeFrom="margin">
+              <wp14:pctWidth>0</wp14:pctWidth>
+            </wp14:sizeRelH>
+            <wp14:sizeRelV relativeFrom="margin">
+              <wp14:pctHeight>0</wp14:pctHeight>
+            </wp14:sizeRelV>
+          </wp:anchor>
+        </w:drawing>
+      </w:r>
       <w:r>
         <w:rPr>
           <w:sz w:val="18"/>
@@ -9338,7 +10327,11 @@
               <w:right w:val="single" w:sz="4" w:space="0" w:color="B7B7B7"/>
             </w:tcBorders>
           </w:tcPr>
-          <w:p/>
+          <w:p>
+            <w:r>
+              <w:t>2 hours</w:t>
+            </w:r>
+          </w:p>
         </w:tc>
       </w:tr>
       <w:tr>
@@ -9418,7 +10411,31 @@
           </w:tcPr>
           <w:p>
             <w:r>
-              <w:t>C:\Users\ryanwa\OneDrive - Redpanda Software\Desktop\My Stuff\Personal\Javascript Training\LogBook\PM01 evidence</w:t>
+              <w:t xml:space="preserve">C:\Users\ryanwa\OneDrive - </w:t>
+            </w:r>
+            <w:proofErr w:type="spellStart"/>
+            <w:r>
+              <w:t>Redpanda</w:t>
+            </w:r>
+            <w:proofErr w:type="spellEnd"/>
+            <w:r>
+              <w:t xml:space="preserve"> Software\Desktop\My Stuff\Personal\</w:t>
+            </w:r>
+            <w:proofErr w:type="spellStart"/>
+            <w:r>
+              <w:t>Javascript</w:t>
+            </w:r>
+            <w:proofErr w:type="spellEnd"/>
+            <w:r>
+              <w:t xml:space="preserve"> Training\</w:t>
+            </w:r>
+            <w:proofErr w:type="spellStart"/>
+            <w:r>
+              <w:t>LogBook</w:t>
+            </w:r>
+            <w:proofErr w:type="spellEnd"/>
+            <w:r>
+              <w:t>\PM01 evidence</w:t>
             </w:r>
           </w:p>
         </w:tc>
@@ -9459,7 +10476,11 @@
               <w:right w:val="single" w:sz="4" w:space="0" w:color="B7B7B7"/>
             </w:tcBorders>
           </w:tcPr>
-          <w:p/>
+          <w:p>
+            <w:r>
+              <w:t>None</w:t>
+            </w:r>
+          </w:p>
         </w:tc>
       </w:tr>
       <w:tr>
@@ -9535,7 +10556,28 @@
           <w:color w:val="888888"/>
           <w:sz w:val="16"/>
         </w:rPr>
-        <w:t>________________________________________________________________________________</w:t>
+        <w:t xml:space="preserve">I completed my </w:t>
+      </w:r>
+      <w:r>
+        <w:rPr>
+          <w:color w:val="888888"/>
+          <w:sz w:val="16"/>
+        </w:rPr>
+        <w:t xml:space="preserve">basic webpage of my team department and </w:t>
+      </w:r>
+      <w:r>
+        <w:rPr>
+          <w:color w:val="888888"/>
+          <w:sz w:val="16"/>
+        </w:rPr>
+        <w:t xml:space="preserve">was able to </w:t>
+      </w:r>
+      <w:r>
+        <w:rPr>
+          <w:color w:val="888888"/>
+          <w:sz w:val="16"/>
+        </w:rPr>
+        <w:t>make commits, push and create a branch from Git commands.</w:t>
       </w:r>
     </w:p>
     <w:p>
@@ -9548,7 +10590,7 @@
           <w:color w:val="888888"/>
           <w:sz w:val="16"/>
         </w:rPr>
-        <w:t>________________________________________________________________________________</w:t>
+        <w:t>_______________________________________________________________________________</w:t>
       </w:r>
     </w:p>
     <w:p>
@@ -9574,7 +10616,7 @@
           <w:color w:val="888888"/>
           <w:sz w:val="16"/>
         </w:rPr>
-        <w:t>________________________________________________________________________________</w:t>
+        <w:t>I applied more alert messages and console.log() showing messages if a button was clicked. Also added a function to the button to show different text and change the colour when clicked.</w:t>
       </w:r>
     </w:p>
     <w:p>
@@ -9587,7 +10629,7 @@
           <w:color w:val="888888"/>
           <w:sz w:val="16"/>
         </w:rPr>
-        <w:t>________________________________________________________________________________</w:t>
+        <w:t>_______________________________________________________________________________</w:t>
       </w:r>
     </w:p>
     <w:p>
@@ -9613,8 +10655,14 @@
           <w:color w:val="888888"/>
           <w:sz w:val="16"/>
         </w:rPr>
-        <w:lastRenderedPageBreak/>
-        <w:t>________________________________________________________________________________</w:t>
+        <w:t>Being able to run all my git commands in the Visual Studio built in terminal</w:t>
+      </w:r>
+      <w:r>
+        <w:rPr>
+          <w:color w:val="888888"/>
+          <w:sz w:val="16"/>
+        </w:rPr>
+        <w:t>.</w:t>
       </w:r>
     </w:p>
     <w:p>
@@ -9627,6 +10675,7 @@
           <w:color w:val="888888"/>
           <w:sz w:val="16"/>
         </w:rPr>
+        <w:lastRenderedPageBreak/>
         <w:t xml:space="preserve">________________________________________________________________________________ </w:t>
       </w:r>
       <w:r>
@@ -9647,7 +10696,7 @@
           <w:color w:val="888888"/>
           <w:sz w:val="16"/>
         </w:rPr>
-        <w:t>________________________________________________________________________________</w:t>
+        <w:t>No errors or difficulties where experienced during this activity</w:t>
       </w:r>
     </w:p>
     <w:p>
@@ -9660,7 +10709,7 @@
           <w:color w:val="888888"/>
           <w:sz w:val="16"/>
         </w:rPr>
-        <w:t>________________________________________________________________________________</w:t>
+        <w:t>_______________________________________________________________________________</w:t>
       </w:r>
     </w:p>
     <w:p>
@@ -9686,7 +10735,35 @@
           <w:color w:val="888888"/>
           <w:sz w:val="16"/>
         </w:rPr>
-        <w:t>________________________________________________________________________________</w:t>
+        <w:t xml:space="preserve">The department I work in uses things like repo, git commands and Visual studio </w:t>
+      </w:r>
+      <w:r>
+        <w:rPr>
+          <w:color w:val="888888"/>
+          <w:sz w:val="16"/>
+        </w:rPr>
+        <w:t>every day</w:t>
+      </w:r>
+      <w:r>
+        <w:rPr>
+          <w:color w:val="888888"/>
+          <w:sz w:val="16"/>
+        </w:rPr>
+        <w:t>.</w:t>
+      </w:r>
+      <w:r>
+        <w:rPr>
+          <w:color w:val="888888"/>
+          <w:sz w:val="16"/>
+        </w:rPr>
+        <w:t xml:space="preserve"> Things like branches are good practice as it can allow the user to make and test any changes without </w:t>
+      </w:r>
+      <w:r>
+        <w:rPr>
+          <w:color w:val="888888"/>
+          <w:sz w:val="16"/>
+        </w:rPr>
+        <w:t>affecting the main branch until the pull request is sent.</w:t>
       </w:r>
     </w:p>
     <w:p>
@@ -9699,7 +10776,7 @@
           <w:color w:val="888888"/>
           <w:sz w:val="16"/>
         </w:rPr>
-        <w:t>________________________________________________________________________________</w:t>
+        <w:t>_______________________________________________________________________________</w:t>
       </w:r>
     </w:p>
     <w:p>
@@ -10604,7 +11681,6 @@
                 <w:color w:val="111111"/>
                 <w:sz w:val="18"/>
               </w:rPr>
-              <w:lastRenderedPageBreak/>
               <w:t>Capture and calculate workplace or retail information using variables and operators.</w:t>
             </w:r>
           </w:p>
@@ -10617,6 +11693,7 @@
         <w:ind w:left="-5"/>
       </w:pPr>
       <w:r>
+        <w:lastRenderedPageBreak/>
         <w:t>Instructions to the learner</w:t>
       </w:r>
     </w:p>
@@ -12048,48 +13125,57 @@
           <w:color w:val="888888"/>
           <w:sz w:val="16"/>
         </w:rPr>
-        <w:t>Understanding s</w:t>
-      </w:r>
+        <w:t xml:space="preserve">Understanding </w:t>
+      </w:r>
+      <w:proofErr w:type="spellStart"/>
       <w:r>
         <w:rPr>
           <w:color w:val="888888"/>
           <w:sz w:val="16"/>
         </w:rPr>
-        <w:t>nystax</w:t>
+        <w:t>s</w:t>
       </w:r>
       <w:r>
         <w:rPr>
           <w:color w:val="888888"/>
           <w:sz w:val="16"/>
         </w:rPr>
-        <w:t xml:space="preserve"> and readability in JavaScript code. Knowing the difference between values </w:t>
-      </w:r>
+        <w:t>nystax</w:t>
+      </w:r>
+      <w:proofErr w:type="spellEnd"/>
       <w:r>
         <w:rPr>
           <w:color w:val="888888"/>
           <w:sz w:val="16"/>
         </w:rPr>
-        <w:t xml:space="preserve">And knowing that </w:t>
+        <w:t xml:space="preserve"> and readability in JavaScript code. Knowing the difference between values </w:t>
       </w:r>
       <w:r>
         <w:rPr>
           <w:color w:val="888888"/>
           <w:sz w:val="16"/>
         </w:rPr>
-        <w:t xml:space="preserve">if the syntax is </w:t>
+        <w:t xml:space="preserve">And knowing that </w:t>
       </w:r>
       <w:r>
         <w:rPr>
           <w:color w:val="888888"/>
           <w:sz w:val="16"/>
         </w:rPr>
-        <w:t>wrong,</w:t>
+        <w:t xml:space="preserve">if the syntax is </w:t>
       </w:r>
       <w:r>
         <w:rPr>
           <w:color w:val="888888"/>
           <w:sz w:val="16"/>
         </w:rPr>
+        <w:t>wrong,</w:t>
+      </w:r>
+      <w:r>
+        <w:rPr>
+          <w:color w:val="888888"/>
+          <w:sz w:val="16"/>
+        </w:rPr>
         <w:t xml:space="preserve"> it will cause the JavaScript to break.</w:t>
       </w:r>
     </w:p>
@@ -12130,41 +13216,57 @@
           <w:color w:val="888888"/>
           <w:sz w:val="16"/>
         </w:rPr>
-        <w:t xml:space="preserve">I applied concepts like const that is a value or item that </w:t>
-      </w:r>
+        <w:t xml:space="preserve">I applied concepts like </w:t>
+      </w:r>
+      <w:proofErr w:type="spellStart"/>
       <w:r>
         <w:rPr>
           <w:color w:val="888888"/>
           <w:sz w:val="16"/>
         </w:rPr>
-        <w:t>cannot be changed, as well as adding let which is a value or item that change</w:t>
-      </w:r>
+        <w:t>const</w:t>
+      </w:r>
+      <w:proofErr w:type="spellEnd"/>
       <w:r>
         <w:rPr>
           <w:color w:val="888888"/>
           <w:sz w:val="16"/>
         </w:rPr>
-        <w:t xml:space="preserve">. Applying the concept of variables as they needed to </w:t>
+        <w:t xml:space="preserve"> that is a value or item that </w:t>
       </w:r>
       <w:r>
         <w:rPr>
           <w:color w:val="888888"/>
           <w:sz w:val="16"/>
         </w:rPr>
-        <w:t>add</w:t>
+        <w:t>cannot be changed, as well as adding let which is a value or item that change</w:t>
       </w:r>
       <w:r>
         <w:rPr>
           <w:color w:val="888888"/>
           <w:sz w:val="16"/>
         </w:rPr>
-        <w:t xml:space="preserve"> in the begin </w:t>
+        <w:t xml:space="preserve">. Applying the concept of variables as they needed to </w:t>
       </w:r>
       <w:r>
         <w:rPr>
           <w:color w:val="888888"/>
           <w:sz w:val="16"/>
         </w:rPr>
+        <w:t>add</w:t>
+      </w:r>
+      <w:r>
+        <w:rPr>
+          <w:color w:val="888888"/>
+          <w:sz w:val="16"/>
+        </w:rPr>
+        <w:t xml:space="preserve"> in the begin </w:t>
+      </w:r>
+      <w:r>
+        <w:rPr>
+          <w:color w:val="888888"/>
+          <w:sz w:val="16"/>
+        </w:rPr>
         <w:t>of any JavaScript.</w:t>
       </w:r>
     </w:p>
@@ -12326,7 +13428,23 @@
           <w:color w:val="888888"/>
           <w:sz w:val="16"/>
         </w:rPr>
-        <w:t>it will add the subtotal and a final amount with VatRate added.</w:t>
+        <w:t xml:space="preserve">it will add the subtotal and a final amount with </w:t>
+      </w:r>
+      <w:proofErr w:type="spellStart"/>
+      <w:r>
+        <w:rPr>
+          <w:color w:val="888888"/>
+          <w:sz w:val="16"/>
+        </w:rPr>
+        <w:t>VatRate</w:t>
+      </w:r>
+      <w:proofErr w:type="spellEnd"/>
+      <w:r>
+        <w:rPr>
+          <w:color w:val="888888"/>
+          <w:sz w:val="16"/>
+        </w:rPr>
+        <w:t xml:space="preserve"> added.</w:t>
       </w:r>
     </w:p>
     <w:p>
@@ -18599,7 +19717,35 @@
         <w:rPr>
           <w:sz w:val="18"/>
         </w:rPr>
-        <w:t>☐ Use console.log(), console.warn() and console.error() appropriately.</w:t>
+        <w:t xml:space="preserve">☐ Use console.log(), </w:t>
+      </w:r>
+      <w:proofErr w:type="spellStart"/>
+      <w:r>
+        <w:rPr>
+          <w:sz w:val="18"/>
+        </w:rPr>
+        <w:t>console.warn</w:t>
+      </w:r>
+      <w:proofErr w:type="spellEnd"/>
+      <w:r>
+        <w:rPr>
+          <w:sz w:val="18"/>
+        </w:rPr>
+        <w:t xml:space="preserve">() and </w:t>
+      </w:r>
+      <w:proofErr w:type="spellStart"/>
+      <w:r>
+        <w:rPr>
+          <w:sz w:val="18"/>
+        </w:rPr>
+        <w:t>console.error</w:t>
+      </w:r>
+      <w:proofErr w:type="spellEnd"/>
+      <w:r>
+        <w:rPr>
+          <w:sz w:val="18"/>
+        </w:rPr>
+        <w:t>() appropriately.</w:t>
       </w:r>
     </w:p>
     <w:p>
@@ -21862,7 +23008,21 @@
         <w:rPr>
           <w:sz w:val="18"/>
         </w:rPr>
-        <w:t>☐ Use event.preventDefault() where appropriate.</w:t>
+        <w:t xml:space="preserve">☐ Use </w:t>
+      </w:r>
+      <w:proofErr w:type="spellStart"/>
+      <w:r>
+        <w:rPr>
+          <w:sz w:val="18"/>
+        </w:rPr>
+        <w:t>event.preventDefault</w:t>
+      </w:r>
+      <w:proofErr w:type="spellEnd"/>
+      <w:r>
+        <w:rPr>
+          <w:sz w:val="18"/>
+        </w:rPr>
+        <w:t>() where appropriate.</w:t>
       </w:r>
     </w:p>
     <w:p>
@@ -40912,11 +42072,19 @@
         <w:spacing w:after="48"/>
         <w:ind w:hanging="360"/>
       </w:pPr>
+      <w:proofErr w:type="spellStart"/>
       <w:r>
         <w:rPr>
           <w:sz w:val="18"/>
         </w:rPr>
-        <w:t>redAcademy JavaScript Fundamentals Curriculum and PM-01 to PM-04 learning content.</w:t>
+        <w:t>redAcademy</w:t>
+      </w:r>
+      <w:proofErr w:type="spellEnd"/>
+      <w:r>
+        <w:rPr>
+          <w:sz w:val="18"/>
+        </w:rPr>
+        <w:t xml:space="preserve"> JavaScript Fundamentals Curriculum and PM-01 to PM-04 learning content.</w:t>
       </w:r>
     </w:p>
     <w:sectPr>
@@ -40971,7 +42139,23 @@
         <w:color w:val="555555"/>
         <w:sz w:val="14"/>
       </w:rPr>
-      <w:t>JavaScript Fundamentals Practical Logbook | SP-220373 | redAcademy Career Accelerator</w:t>
+      <w:t xml:space="preserve">JavaScript Fundamentals Practical Logbook | SP-220373 | </w:t>
+    </w:r>
+    <w:proofErr w:type="spellStart"/>
+    <w:r>
+      <w:rPr>
+        <w:color w:val="555555"/>
+        <w:sz w:val="14"/>
+      </w:rPr>
+      <w:t>redAcademy</w:t>
+    </w:r>
+    <w:proofErr w:type="spellEnd"/>
+    <w:r>
+      <w:rPr>
+        <w:color w:val="555555"/>
+        <w:sz w:val="14"/>
+      </w:rPr>
+      <w:t xml:space="preserve"> Career Accelerator</w:t>
     </w:r>
   </w:p>
   <w:p>
@@ -41023,7 +42207,23 @@
         <w:color w:val="555555"/>
         <w:sz w:val="14"/>
       </w:rPr>
-      <w:t>JavaScript Fundamentals Practical Logbook | SP-220373 | redAcademy Career Accelerator</w:t>
+      <w:t xml:space="preserve">JavaScript Fundamentals Practical Logbook | SP-220373 | </w:t>
+    </w:r>
+    <w:proofErr w:type="spellStart"/>
+    <w:r>
+      <w:rPr>
+        <w:color w:val="555555"/>
+        <w:sz w:val="14"/>
+      </w:rPr>
+      <w:t>redAcademy</w:t>
+    </w:r>
+    <w:proofErr w:type="spellEnd"/>
+    <w:r>
+      <w:rPr>
+        <w:color w:val="555555"/>
+        <w:sz w:val="14"/>
+      </w:rPr>
+      <w:t xml:space="preserve"> Career Accelerator</w:t>
     </w:r>
   </w:p>
   <w:p>
@@ -41075,7 +42275,23 @@
         <w:color w:val="555555"/>
         <w:sz w:val="14"/>
       </w:rPr>
-      <w:t>JavaScript Fundamentals Practical Logbook | SP-220373 | redAcademy Career Accelerator</w:t>
+      <w:t xml:space="preserve">JavaScript Fundamentals Practical Logbook | SP-220373 | </w:t>
+    </w:r>
+    <w:proofErr w:type="spellStart"/>
+    <w:r>
+      <w:rPr>
+        <w:color w:val="555555"/>
+        <w:sz w:val="14"/>
+      </w:rPr>
+      <w:t>redAcademy</w:t>
+    </w:r>
+    <w:proofErr w:type="spellEnd"/>
+    <w:r>
+      <w:rPr>
+        <w:color w:val="555555"/>
+        <w:sz w:val="14"/>
+      </w:rPr>
+      <w:t xml:space="preserve"> Career Accelerator</w:t>
     </w:r>
   </w:p>
   <w:p>
@@ -41128,7 +42344,23 @@
         <w:color w:val="555555"/>
         <w:sz w:val="14"/>
       </w:rPr>
-      <w:t>JavaScript Fundamentals Practical Logbook | SP-220373 | redAcademy Career Accelerator</w:t>
+      <w:t xml:space="preserve">JavaScript Fundamentals Practical Logbook | SP-220373 | </w:t>
+    </w:r>
+    <w:proofErr w:type="spellStart"/>
+    <w:r>
+      <w:rPr>
+        <w:color w:val="555555"/>
+        <w:sz w:val="14"/>
+      </w:rPr>
+      <w:t>redAcademy</w:t>
+    </w:r>
+    <w:proofErr w:type="spellEnd"/>
+    <w:r>
+      <w:rPr>
+        <w:color w:val="555555"/>
+        <w:sz w:val="14"/>
+      </w:rPr>
+      <w:t xml:space="preserve"> Career Accelerator</w:t>
     </w:r>
   </w:p>
   <w:p>
@@ -41181,7 +42413,23 @@
         <w:color w:val="555555"/>
         <w:sz w:val="14"/>
       </w:rPr>
-      <w:t>JavaScript Fundamentals Practical Logbook | SP-220373 | redAcademy Career Accelerator</w:t>
+      <w:t xml:space="preserve">JavaScript Fundamentals Practical Logbook | SP-220373 | </w:t>
+    </w:r>
+    <w:proofErr w:type="spellStart"/>
+    <w:r>
+      <w:rPr>
+        <w:color w:val="555555"/>
+        <w:sz w:val="14"/>
+      </w:rPr>
+      <w:t>redAcademy</w:t>
+    </w:r>
+    <w:proofErr w:type="spellEnd"/>
+    <w:r>
+      <w:rPr>
+        <w:color w:val="555555"/>
+        <w:sz w:val="14"/>
+      </w:rPr>
+      <w:t xml:space="preserve"> Career Accelerator</w:t>
     </w:r>
   </w:p>
   <w:p>
@@ -41234,7 +42482,23 @@
         <w:color w:val="555555"/>
         <w:sz w:val="14"/>
       </w:rPr>
-      <w:t>JavaScript Fundamentals Practical Logbook | SP-220373 | redAcademy Career Accelerator</w:t>
+      <w:t xml:space="preserve">JavaScript Fundamentals Practical Logbook | SP-220373 | </w:t>
+    </w:r>
+    <w:proofErr w:type="spellStart"/>
+    <w:r>
+      <w:rPr>
+        <w:color w:val="555555"/>
+        <w:sz w:val="14"/>
+      </w:rPr>
+      <w:t>redAcademy</w:t>
+    </w:r>
+    <w:proofErr w:type="spellEnd"/>
+    <w:r>
+      <w:rPr>
+        <w:color w:val="555555"/>
+        <w:sz w:val="14"/>
+      </w:rPr>
+      <w:t xml:space="preserve"> Career Accelerator</w:t>
     </w:r>
   </w:p>
   <w:p>

</xml_diff>